<commit_message>
BRD-13 Data Migration document set: layout fixes, register references, no account codes
Co-Authored-By: Claude Opus 5.5 <noreply@anthropic.com>
Claude-Session: https://claude.ai/code/session_01W3DAuLtsQmip7EuxjJCCtN
</commit_message>
<xml_diff>
--- a/docs/deliverables/out/Migration/BIBS_Migration_BRD-13_Cutover_Runbook_v1.0.docx
+++ b/docs/deliverables/out/Migration/BIBS_Migration_BRD-13_Cutover_Runbook_v1.0.docx
@@ -2867,7 +2867,7 @@
               <w:rPr>
                 <w:sz w:val="17"/>
               </w:rPr>
-              <w:t>BDOI IT (legacy systems</w:t>
+              <w:t>BDOI IT (legacy systems, extracts, network, SFTP)</w:t>
             </w:r>
           </w:p>
         </w:tc>
@@ -2889,7 +2889,7 @@
               <w:rPr>
                 <w:sz w:val="17"/>
               </w:rPr>
-              <w:t>extracts</w:t>
+              <w:t>BDOI</w:t>
             </w:r>
           </w:p>
         </w:tc>
@@ -3088,7 +3088,7 @@
               <w:rPr>
                 <w:sz w:val="17"/>
               </w:rPr>
-              <w:t>iorta TechNXT Migration Lead (loaders</w:t>
+              <w:t>iorta TechNXT Migration Lead (loaders, reconciliation, console)</w:t>
             </w:r>
           </w:p>
         </w:tc>
@@ -3111,7 +3111,7 @@
               <w:rPr>
                 <w:sz w:val="17"/>
               </w:rPr>
-              <w:t>reconciliation</w:t>
+              <w:t>iorta TechNXT</w:t>
             </w:r>
           </w:p>
         </w:tc>
@@ -3161,7 +3161,7 @@
               <w:rPr>
                 <w:sz w:val="17"/>
               </w:rPr>
-              <w:t>iorta TechNXT Migration Operator (intake</w:t>
+              <w:t>iorta TechNXT Migration Operator (intake, validation, loads)</w:t>
             </w:r>
           </w:p>
         </w:tc>
@@ -3183,7 +3183,7 @@
               <w:rPr>
                 <w:sz w:val="17"/>
               </w:rPr>
-              <w:t>validation</w:t>
+              <w:t>iorta TechNXT</w:t>
             </w:r>
           </w:p>
         </w:tc>
@@ -3235,7 +3235,7 @@
               <w:rPr>
                 <w:sz w:val="17"/>
               </w:rPr>
-              <w:t>iorta TechNXT DevOps (AWS environment</w:t>
+              <w:t>iorta TechNXT DevOps (AWS environment, snapshots, access, monitoring)</w:t>
             </w:r>
           </w:p>
         </w:tc>
@@ -3258,7 +3258,7 @@
               <w:rPr>
                 <w:sz w:val="17"/>
               </w:rPr>
-              <w:t>snapshots</w:t>
+              <w:t>iorta TechNXT</w:t>
             </w:r>
           </w:p>
         </w:tc>
@@ -3308,7 +3308,7 @@
               <w:rPr>
                 <w:sz w:val="17"/>
               </w:rPr>
-              <w:t>iorta TechNXT QA (smoke tests</w:t>
+              <w:t>iorta TechNXT QA (smoke tests, defect triage)</w:t>
             </w:r>
           </w:p>
         </w:tc>
@@ -3330,7 +3330,7 @@
               <w:rPr>
                 <w:sz w:val="17"/>
               </w:rPr>
-              <w:t>defect triage)</w:t>
+              <w:t>iorta TechNXT</w:t>
             </w:r>
           </w:p>
         </w:tc>

</xml_diff>